<commit_message>
feat: vessel particulars UX + light mode contrast refinements
- Add delete-confirmation modal before removing uploaded files
- Set class field default prompt text
- Update upload/delete button mode behavior and state handling
- Refine light mode Frontpage container/button styling
- Improve light mode success notification contrast across pages
- Align action/dropdown button visuals and sizing adjustments
</commit_message>
<xml_diff>
--- a/Terminal commands to launch fpadev.docx
+++ b/Terminal commands to launch fpadev.docx
@@ -96,15 +96,7 @@
     <w:p>
       <w:r>
         <w:br/>
-      </w:r>
-      <w:r>
-        <w:t xml:space="preserve">RUN ON TERMINAL TO </w:t>
-      </w:r>
-      <w:r>
-        <w:t>STOP</w:t>
-      </w:r>
-      <w:r>
-        <w:t xml:space="preserve"> SERVER FOR FPA DEV DOCKPILOT:</w:t>
+        <w:t>RUN ON TERMINAL TO STOP SERVER FOR FPA DEV DOCKPILOT:</w:t>
       </w:r>
     </w:p>
     <w:p>
@@ -169,6 +161,41 @@
         <w:t>stop_dockpilot_local.command</w:t>
       </w:r>
       <w:proofErr w:type="spellEnd"/>
+      <w:r>
+        <w:rPr>
+          <w:color w:val="EE0000"/>
+        </w:rPr>
+        <w:br/>
+      </w:r>
+      <w:r>
+        <w:rPr>
+          <w:color w:val="EE0000"/>
+        </w:rPr>
+        <w:br/>
+      </w:r>
+      <w:r>
+        <w:rPr>
+          <w:color w:val="000000" w:themeColor="text1"/>
+        </w:rPr>
+        <w:t>Created below 03052026: for revert to pre theme change settings</w:t>
+      </w:r>
+      <w:r>
+        <w:rPr>
+          <w:color w:val="EE0000"/>
+        </w:rPr>
+        <w:br/>
+      </w:r>
+      <w:r>
+        <w:rPr>
+          <w:rStyle w:val="HTMLCode"/>
+          <w:rFonts w:ascii="Monaco" w:eastAsiaTheme="minorHAnsi" w:hAnsi="Monaco"/>
+          <w:color w:val="D7BA7D"/>
+          <w:sz w:val="16"/>
+          <w:szCs w:val="16"/>
+          <w:bdr w:val="none" w:sz="0" w:space="0" w:color="auto" w:frame="1"/>
+        </w:rPr>
+        <w:t>git checkout revert/pre-color-preference-20260503</w:t>
+      </w:r>
     </w:p>
     <w:sectPr>
       <w:pgSz w:w="11906" w:h="16838"/>
@@ -1092,6 +1119,19 @@
       <w:spacing w:val="5"/>
     </w:rPr>
   </w:style>
+  <w:style w:type="character" w:styleId="HTMLCode">
+    <w:name w:val="HTML Code"/>
+    <w:basedOn w:val="DefaultParagraphFont"/>
+    <w:uiPriority w:val="99"/>
+    <w:semiHidden/>
+    <w:unhideWhenUsed/>
+    <w:rsid w:val="00825D43"/>
+    <w:rPr>
+      <w:rFonts w:ascii="Courier New" w:eastAsia="Times New Roman" w:hAnsi="Courier New" w:cs="Courier New"/>
+      <w:sz w:val="20"/>
+      <w:szCs w:val="20"/>
+    </w:rPr>
+  </w:style>
 </w:styles>
 </file>
 

</xml_diff>

<commit_message>
Implement launch folder workflow and project links panel
</commit_message>
<xml_diff>
--- a/Terminal commands to launch fpadev.docx
+++ b/Terminal commands to launch fpadev.docx
@@ -1,6 +1,6 @@
 
 <file path=word/document.xml><?xml version="1.0" encoding="utf-8"?>
-<w:document xmlns:wpc="http://schemas.microsoft.com/office/word/2010/wordprocessingCanvas" xmlns:cx="http://schemas.microsoft.com/office/drawing/2014/chartex" xmlns:cx1="http://schemas.microsoft.com/office/drawing/2015/9/8/chartex" xmlns:cx2="http://schemas.microsoft.com/office/drawing/2015/10/21/chartex" xmlns:cx3="http://schemas.microsoft.com/office/drawing/2016/5/9/chartex" xmlns:cx4="http://schemas.microsoft.com/office/drawing/2016/5/10/chartex" xmlns:cx5="http://schemas.microsoft.com/office/drawing/2016/5/11/chartex" xmlns:cx6="http://schemas.microsoft.com/office/drawing/2016/5/12/chartex" xmlns:cx7="http://schemas.microsoft.com/office/drawing/2016/5/13/chartex" xmlns:cx8="http://schemas.microsoft.com/office/drawing/2016/5/14/chartex" xmlns:mc="http://schemas.openxmlformats.org/markup-compatibility/2006" xmlns:aink="http://schemas.microsoft.com/office/drawing/2016/ink" xmlns:am3d="http://schemas.microsoft.com/office/drawing/2017/model3d" xmlns:o="urn:schemas-microsoft-com:office:office" xmlns:oel="http://schemas.microsoft.com/office/2019/extlst" xmlns:r="http://schemas.openxmlformats.org/officeDocument/2006/relationships" xmlns:m="http://schemas.openxmlformats.org/officeDocument/2006/math" xmlns:v="urn:schemas-microsoft-com:vml" xmlns:wp14="http://schemas.microsoft.com/office/word/2010/wordprocessingDrawing" xmlns:wp="http://schemas.openxmlformats.org/drawingml/2006/wordprocessingDrawing" xmlns:w10="urn:schemas-microsoft-com:office:word" xmlns:w="http://schemas.openxmlformats.org/wordprocessingml/2006/main" xmlns:w14="http://schemas.microsoft.com/office/word/2010/wordml" xmlns:w15="http://schemas.microsoft.com/office/word/2012/wordml" xmlns:w16cex="http://schemas.microsoft.com/office/word/2018/wordml/cex" xmlns:w16cid="http://schemas.microsoft.com/office/word/2016/wordml/cid" xmlns:w16="http://schemas.microsoft.com/office/word/2018/wordml" xmlns:w16du="http://schemas.microsoft.com/office/word/2023/wordml/word16du" xmlns:w16sdtdh="http://schemas.microsoft.com/office/word/2020/wordml/sdtdatahash" xmlns:w16sdtfl="http://schemas.microsoft.com/office/word/2024/wordml/sdtformatlock" xmlns:w16se="http://schemas.microsoft.com/office/word/2015/wordml/symex" xmlns:wpg="http://schemas.microsoft.com/office/word/2010/wordprocessingGroup" xmlns:wpi="http://schemas.microsoft.com/office/word/2010/wordprocessingInk" xmlns:wne="http://schemas.microsoft.com/office/word/2006/wordml" xmlns:wps="http://schemas.microsoft.com/office/word/2010/wordprocessingShape" mc:Ignorable="w14 w15 w16se w16cid w16 w16cex w16sdtdh w16sdtfl w16du wp14">
+<w:document xmlns:wpc="http://schemas.microsoft.com/office/word/2010/wordprocessingCanvas" xmlns:cx="http://schemas.microsoft.com/office/drawing/2014/chartex" xmlns:cx1="http://schemas.microsoft.com/office/drawing/2015/9/8/chartex" xmlns:cx2="http://schemas.microsoft.com/office/drawing/2015/10/21/chartex" xmlns:cx3="http://schemas.microsoft.com/office/drawing/2016/5/9/chartex" xmlns:cx4="http://schemas.microsoft.com/office/drawing/2016/5/10/chartex" xmlns:cx5="http://schemas.microsoft.com/office/drawing/2016/5/11/chartex" xmlns:cx6="http://schemas.microsoft.com/office/drawing/2016/5/12/chartex" xmlns:cx7="http://schemas.microsoft.com/office/drawing/2016/5/13/chartex" xmlns:cx8="http://schemas.microsoft.com/office/drawing/2016/5/14/chartex" xmlns:mc="http://schemas.openxmlformats.org/markup-compatibility/2006" xmlns:m="http://schemas.openxmlformats.org/officeDocument/2006/math" xmlns:aink="http://schemas.microsoft.com/office/drawing/2016/ink" xmlns:am3d="http://schemas.microsoft.com/office/drawing/2017/model3d" xmlns:oel="http://schemas.microsoft.com/office/2019/extlst" xmlns:r="http://schemas.openxmlformats.org/officeDocument/2006/relationships" xmlns:wp14="http://schemas.microsoft.com/office/word/2010/wordprocessingDrawing" xmlns:wp="http://schemas.openxmlformats.org/drawingml/2006/wordprocessingDrawing" xmlns:wpg="http://schemas.microsoft.com/office/word/2010/wordprocessingGroup" xmlns:wpi="http://schemas.microsoft.com/office/word/2010/wordprocessingInk" xmlns:wps="http://schemas.microsoft.com/office/word/2010/wordprocessingShape" xmlns:o="urn:schemas-microsoft-com:office:office" xmlns:v="urn:schemas-microsoft-com:vml" xmlns:w10="urn:schemas-microsoft-com:office:word" xmlns:w="http://schemas.openxmlformats.org/wordprocessingml/2006/main" xmlns:w14="http://schemas.microsoft.com/office/word/2010/wordml" xmlns:w15="http://schemas.microsoft.com/office/word/2012/wordml" xmlns:w16cex="http://schemas.microsoft.com/office/word/2018/wordml/cex" xmlns:w16cid="http://schemas.microsoft.com/office/word/2016/wordml/cid" xmlns:w16="http://schemas.microsoft.com/office/word/2018/wordml" xmlns:w16sdtdh="http://schemas.microsoft.com/office/word/2020/wordml/sdtdatahash" xmlns:w16sdtfl="http://schemas.microsoft.com/office/word/2024/wordml/sdtformatlock" xmlns:w16se="http://schemas.microsoft.com/office/word/2015/wordml/symex" xmlns:w16du="http://schemas.microsoft.com/office/word/2023/wordml/word16du" xmlns:wne="http://schemas.microsoft.com/office/word/2006/wordml" mc:Ignorable="w14 w15 w16se w16cid w16 w16cex w16sdtdh w16sdtfl w16du wp14">
   <w:body>
     <w:p>
       <w:r>
@@ -101,91 +101,6 @@
     </w:p>
     <w:p>
       <w:pPr>
-        <w:rPr>
-          <w:color w:val="EE0000"/>
-        </w:rPr>
-      </w:pPr>
-      <w:r>
-        <w:rPr>
-          <w:color w:val="EE0000"/>
-        </w:rPr>
-        <w:t>cd "/Users/</w:t>
-      </w:r>
-      <w:proofErr w:type="spellStart"/>
-      <w:r>
-        <w:rPr>
-          <w:color w:val="EE0000"/>
-        </w:rPr>
-        <w:t>debdeeptochattopadhyay</w:t>
-      </w:r>
-      <w:proofErr w:type="spellEnd"/>
-      <w:r>
-        <w:rPr>
-          <w:color w:val="EE0000"/>
-        </w:rPr>
-        <w:t>/</w:t>
-      </w:r>
-      <w:proofErr w:type="spellStart"/>
-      <w:r>
-        <w:rPr>
-          <w:color w:val="EE0000"/>
-        </w:rPr>
-        <w:t>Supabase</w:t>
-      </w:r>
-      <w:proofErr w:type="spellEnd"/>
-      <w:r>
-        <w:rPr>
-          <w:color w:val="EE0000"/>
-        </w:rPr>
-        <w:t xml:space="preserve"> A/</w:t>
-      </w:r>
-      <w:proofErr w:type="spellStart"/>
-      <w:r>
-        <w:rPr>
-          <w:color w:val="EE0000"/>
-        </w:rPr>
-        <w:t>DockPilot</w:t>
-      </w:r>
-      <w:proofErr w:type="spellEnd"/>
-      <w:r>
-        <w:rPr>
-          <w:color w:val="EE0000"/>
-        </w:rPr>
-        <w:t>" &amp;&amp; ./</w:t>
-      </w:r>
-      <w:proofErr w:type="spellStart"/>
-      <w:r>
-        <w:rPr>
-          <w:color w:val="EE0000"/>
-        </w:rPr>
-        <w:t>stop_dockpilot_local.command</w:t>
-      </w:r>
-      <w:proofErr w:type="spellEnd"/>
-      <w:r>
-        <w:rPr>
-          <w:color w:val="EE0000"/>
-        </w:rPr>
-        <w:br/>
-      </w:r>
-      <w:r>
-        <w:rPr>
-          <w:color w:val="EE0000"/>
-        </w:rPr>
-        <w:br/>
-      </w:r>
-      <w:r>
-        <w:rPr>
-          <w:color w:val="000000" w:themeColor="text1"/>
-        </w:rPr>
-        <w:t>Created below 03052026: for revert to pre theme change settings</w:t>
-      </w:r>
-      <w:r>
-        <w:rPr>
-          <w:color w:val="EE0000"/>
-        </w:rPr>
-        <w:br/>
-      </w:r>
-      <w:r>
         <w:rPr>
           <w:rStyle w:val="HTMLCode"/>
           <w:rFonts w:ascii="Monaco" w:eastAsiaTheme="minorHAnsi" w:hAnsi="Monaco"/>
@@ -194,7 +109,219 @@
           <w:szCs w:val="16"/>
           <w:bdr w:val="none" w:sz="0" w:space="0" w:color="auto" w:frame="1"/>
         </w:rPr>
+      </w:pPr>
+      <w:r>
+        <w:rPr>
+          <w:color w:val="EE0000"/>
+        </w:rPr>
+        <w:t>cd "/Users/</w:t>
+      </w:r>
+      <w:proofErr w:type="spellStart"/>
+      <w:r>
+        <w:rPr>
+          <w:color w:val="EE0000"/>
+        </w:rPr>
+        <w:t>debdeeptochattopadhyay</w:t>
+      </w:r>
+      <w:proofErr w:type="spellEnd"/>
+      <w:r>
+        <w:rPr>
+          <w:color w:val="EE0000"/>
+        </w:rPr>
+        <w:t>/</w:t>
+      </w:r>
+      <w:proofErr w:type="spellStart"/>
+      <w:r>
+        <w:rPr>
+          <w:color w:val="EE0000"/>
+        </w:rPr>
+        <w:t>Supabase</w:t>
+      </w:r>
+      <w:proofErr w:type="spellEnd"/>
+      <w:r>
+        <w:rPr>
+          <w:color w:val="EE0000"/>
+        </w:rPr>
+        <w:t xml:space="preserve"> A/</w:t>
+      </w:r>
+      <w:proofErr w:type="spellStart"/>
+      <w:r>
+        <w:rPr>
+          <w:color w:val="EE0000"/>
+        </w:rPr>
+        <w:t>DockPilot</w:t>
+      </w:r>
+      <w:proofErr w:type="spellEnd"/>
+      <w:r>
+        <w:rPr>
+          <w:color w:val="EE0000"/>
+        </w:rPr>
+        <w:t>" &amp;&amp; ./</w:t>
+      </w:r>
+      <w:proofErr w:type="spellStart"/>
+      <w:r>
+        <w:rPr>
+          <w:color w:val="EE0000"/>
+        </w:rPr>
+        <w:t>stop_dockpilot_local.command</w:t>
+      </w:r>
+      <w:proofErr w:type="spellEnd"/>
+      <w:r>
+        <w:rPr>
+          <w:color w:val="EE0000"/>
+        </w:rPr>
+        <w:br/>
+      </w:r>
+      <w:r>
+        <w:rPr>
+          <w:color w:val="EE0000"/>
+        </w:rPr>
+        <w:br/>
+      </w:r>
+      <w:r>
+        <w:rPr>
+          <w:color w:val="000000" w:themeColor="text1"/>
+        </w:rPr>
+        <w:t>Created below 03052026: for revert to pre theme change settings</w:t>
+      </w:r>
+      <w:r>
+        <w:rPr>
+          <w:color w:val="EE0000"/>
+        </w:rPr>
+        <w:br/>
+      </w:r>
+      <w:r>
+        <w:rPr>
+          <w:rStyle w:val="HTMLCode"/>
+          <w:rFonts w:ascii="Monaco" w:eastAsiaTheme="minorHAnsi" w:hAnsi="Monaco"/>
+          <w:color w:val="D7BA7D"/>
+          <w:sz w:val="16"/>
+          <w:szCs w:val="16"/>
+          <w:bdr w:val="none" w:sz="0" w:space="0" w:color="auto" w:frame="1"/>
+        </w:rPr>
         <w:t>git checkout revert/pre-color-preference-20260503</w:t>
+      </w:r>
+      <w:r>
+        <w:rPr>
+          <w:rStyle w:val="HTMLCode"/>
+          <w:rFonts w:ascii="Monaco" w:eastAsiaTheme="minorHAnsi" w:hAnsi="Monaco"/>
+          <w:color w:val="D7BA7D"/>
+          <w:sz w:val="16"/>
+          <w:szCs w:val="16"/>
+          <w:bdr w:val="none" w:sz="0" w:space="0" w:color="auto" w:frame="1"/>
+        </w:rPr>
+        <w:br/>
+      </w:r>
+      <w:r>
+        <w:rPr>
+          <w:rStyle w:val="HTMLCode"/>
+          <w:rFonts w:ascii="Monaco" w:eastAsiaTheme="minorHAnsi" w:hAnsi="Monaco"/>
+          <w:color w:val="D7BA7D"/>
+          <w:sz w:val="16"/>
+          <w:szCs w:val="16"/>
+          <w:bdr w:val="none" w:sz="0" w:space="0" w:color="auto" w:frame="1"/>
+        </w:rPr>
+        <w:br/>
+      </w:r>
+    </w:p>
+    <w:p>
+      <w:pPr>
+        <w:rPr>
+          <w:rStyle w:val="HTMLCode"/>
+          <w:rFonts w:ascii="Monaco" w:eastAsiaTheme="minorHAnsi" w:hAnsi="Monaco"/>
+          <w:color w:val="D7BA7D"/>
+          <w:sz w:val="16"/>
+          <w:szCs w:val="16"/>
+          <w:bdr w:val="none" w:sz="0" w:space="0" w:color="auto" w:frame="1"/>
+        </w:rPr>
+      </w:pPr>
+    </w:p>
+    <w:p>
+      <w:pPr>
+        <w:rPr>
+          <w:rFonts w:asciiTheme="majorHAnsi" w:hAnsiTheme="majorHAnsi"/>
+        </w:rPr>
+      </w:pPr>
+      <w:r>
+        <w:rPr>
+          <w:rStyle w:val="HTMLCode"/>
+          <w:rFonts w:ascii="Monaco" w:eastAsiaTheme="minorHAnsi" w:hAnsi="Monaco"/>
+          <w:color w:val="D7BA7D"/>
+          <w:sz w:val="16"/>
+          <w:szCs w:val="16"/>
+          <w:bdr w:val="none" w:sz="0" w:space="0" w:color="auto" w:frame="1"/>
+        </w:rPr>
+        <w:t xml:space="preserve">&gt;&gt;&gt; Important for DD Project Frontpage and Edit Running Project&lt;&lt;&lt; </w:t>
+      </w:r>
+      <w:r>
+        <w:rPr>
+          <w:rStyle w:val="HTMLCode"/>
+          <w:rFonts w:ascii="Monaco" w:eastAsiaTheme="minorHAnsi" w:hAnsi="Monaco"/>
+          <w:color w:val="D7BA7D"/>
+          <w:sz w:val="16"/>
+          <w:szCs w:val="16"/>
+          <w:bdr w:val="none" w:sz="0" w:space="0" w:color="auto" w:frame="1"/>
+        </w:rPr>
+        <w:br/>
+      </w:r>
+      <w:r>
+        <w:rPr>
+          <w:rFonts w:asciiTheme="majorHAnsi" w:hAnsiTheme="majorHAnsi"/>
+        </w:rPr>
+        <w:t>Great question. You should ask for this exact item later:</w:t>
+      </w:r>
+    </w:p>
+    <w:p>
+      <w:pPr>
+        <w:rPr>
+          <w:rFonts w:asciiTheme="majorHAnsi" w:hAnsiTheme="majorHAnsi"/>
+        </w:rPr>
+      </w:pPr>
+    </w:p>
+    <w:p>
+      <w:pPr>
+        <w:rPr>
+          <w:rFonts w:asciiTheme="majorHAnsi" w:hAnsiTheme="majorHAnsi"/>
+        </w:rPr>
+      </w:pPr>
+      <w:r>
+        <w:rPr>
+          <w:rFonts w:asciiTheme="majorHAnsi" w:hAnsiTheme="majorHAnsi"/>
+        </w:rPr>
+        <w:t>“Activate the running-project handoff hook from dd-project-frontpage to running-dd-project, using the stored project context payload key, and wire running-dd-project to consume and render it.”</w:t>
+      </w:r>
+    </w:p>
+    <w:p>
+      <w:pPr>
+        <w:rPr>
+          <w:rFonts w:asciiTheme="majorHAnsi" w:hAnsiTheme="majorHAnsi"/>
+        </w:rPr>
+      </w:pPr>
+    </w:p>
+    <w:p>
+      <w:pPr>
+        <w:rPr>
+          <w:rFonts w:asciiTheme="majorHAnsi" w:hAnsiTheme="majorHAnsi"/>
+        </w:rPr>
+      </w:pPr>
+      <w:r>
+        <w:rPr>
+          <w:rFonts w:asciiTheme="majorHAnsi" w:hAnsiTheme="majorHAnsi"/>
+        </w:rPr>
+        <w:t>Short version you can reuse:</w:t>
+      </w:r>
+    </w:p>
+    <w:p>
+      <w:pPr>
+        <w:rPr>
+          <w:rFonts w:asciiTheme="majorHAnsi" w:hAnsiTheme="majorHAnsi"/>
+        </w:rPr>
+      </w:pPr>
+      <w:r>
+        <w:rPr>
+          <w:rFonts w:asciiTheme="majorHAnsi" w:hAnsiTheme="majorHAnsi"/>
+        </w:rPr>
+        <w:t>“Please wire the dd-project-frontpage → running-dd-project context hook.”</w:t>
       </w:r>
     </w:p>
     <w:sectPr>
@@ -208,7 +335,7 @@
 </file>
 
 <file path=word/styles.xml><?xml version="1.0" encoding="utf-8"?>
-<w:styles xmlns:mc="http://schemas.openxmlformats.org/markup-compatibility/2006" xmlns:r="http://schemas.openxmlformats.org/officeDocument/2006/relationships" xmlns:w="http://schemas.openxmlformats.org/wordprocessingml/2006/main" xmlns:w14="http://schemas.microsoft.com/office/word/2010/wordml" xmlns:w15="http://schemas.microsoft.com/office/word/2012/wordml" xmlns:w16cex="http://schemas.microsoft.com/office/word/2018/wordml/cex" xmlns:w16cid="http://schemas.microsoft.com/office/word/2016/wordml/cid" xmlns:w16="http://schemas.microsoft.com/office/word/2018/wordml" xmlns:w16du="http://schemas.microsoft.com/office/word/2023/wordml/word16du" xmlns:w16sdtdh="http://schemas.microsoft.com/office/word/2020/wordml/sdtdatahash" xmlns:w16sdtfl="http://schemas.microsoft.com/office/word/2024/wordml/sdtformatlock" xmlns:w16se="http://schemas.microsoft.com/office/word/2015/wordml/symex" mc:Ignorable="w14 w15 w16se w16cid w16 w16cex w16sdtdh w16sdtfl w16du">
+<w:styles xmlns:mc="http://schemas.openxmlformats.org/markup-compatibility/2006" xmlns:r="http://schemas.openxmlformats.org/officeDocument/2006/relationships" xmlns:w="http://schemas.openxmlformats.org/wordprocessingml/2006/main" xmlns:w14="http://schemas.microsoft.com/office/word/2010/wordml" xmlns:w15="http://schemas.microsoft.com/office/word/2012/wordml" xmlns:w16cex="http://schemas.microsoft.com/office/word/2018/wordml/cex" xmlns:w16cid="http://schemas.microsoft.com/office/word/2016/wordml/cid" xmlns:w16="http://schemas.microsoft.com/office/word/2018/wordml" xmlns:w16sdtdh="http://schemas.microsoft.com/office/word/2020/wordml/sdtdatahash" xmlns:w16sdtfl="http://schemas.microsoft.com/office/word/2024/wordml/sdtformatlock" xmlns:w16se="http://schemas.microsoft.com/office/word/2015/wordml/symex" xmlns:w16du="http://schemas.microsoft.com/office/word/2023/wordml/word16du" mc:Ignorable="w14 w15 w16se w16cid w16 w16cex w16sdtdh w16sdtfl w16du">
   <w:docDefaults>
     <w:rPrDefault>
       <w:rPr>

</xml_diff>